<commit_message>
Session: ms.js edit, patent spec update, cost sweep record
</commit_message>
<xml_diff>
--- a/Patents/TrustSquare_Provisional_Specification_DRAFT_2026-06-11.docx
+++ b/Patents/TrustSquare_Provisional_Specification_DRAFT_2026-06-11.docx
@@ -51,7 +51,7 @@
           <w:i w:val="0"/>
           <w:sz w:val="21"/>
         </w:rPr>
-        <w:t>Applicant: Trustsquare (Pty) Ltd, Reg 2026/340128/07, South Africa. Inventor: David Maurice Conradie. Forms P1 + P6 via iponline.cipc.co.za; official provisional fee ±R60.</w:t>
+        <w:t>Applicant (proprietor): David Maurice Conradie (natural person), South Africa. Inventor: David Maurice Conradie. [Ownership note 22 Jun 2026: filed in the inventor's personal name to keep the IP portable across jurisdictions/entities; an operating licence to Trustsquare (Pty) Ltd, Reg 2026/340128/07, to be executed separately.] Forms P1 + P6 via iponline.cipc.co.za; Official fee R590 (Form P1; P6/P2 no separate fee) — per CIPC forms-and-fees, verified 22 Jun 2026.</w:t>
       </w:r>
     </w:p>
     <w:p>
@@ -318,6 +318,11 @@
     <w:p>
       <w:r>
         <w:t>(S3 update, 17 Jun 2026) The detailed description (Whitepaper v3.5 §3.2, §3.5) now includes: (a) the non-rolling grant property — unspent granted Tuppence is swept at each monthly allocation, recited as a further instance of the existing time-based expiry of unspent float, NOT a new claim (David ruling); and (b) the paid-feed AI-class tier gate as a cost-integrity guardrail within the protected subscription/AI-services/guardrail combination. No claim text changes; Element 2A and C10–C13 unaffected.</w:t>
+      </w:r>
+    </w:p>
+    <w:p>
+      <w:r>
+        <w:t>(Re-check update, 22 Jun 2026) The detailed description (Whitepaper v3.5) further discloses, as non-limiting embodiments: (a) a listing-availability/occupancy axis whereby a seller listing carries a typed availability state (e.g. available / reserved / occupied) and an optional available-from date, from which the system derives a buyer-visible availability label and gates or annotates introduction affordances accordingly — applicable to rental, property, and time-bounded service listings; and (b) by way of illustrative non-limiting example only, the value unit may be denominated such that one unit corresponds to a fixed reference amount (e.g. 1T = USD $2), the platform remaining operable at any denomination — the claims being denomination-agnostic and not limited to any stated price.</w:t>
       </w:r>
     </w:p>
     <w:p>

</xml_diff>